<commit_message>
Agregar evidencias graficas para tesis
</commit_message>
<xml_diff>
--- a/docs/INFORME_FINAL_IDSML_HOSPITAL_CARRION.docx
+++ b/docs/INFORME_FINAL_IDSML_HOSPITAL_CARRION.docx
@@ -38273,6 +38273,297 @@
         </w:tc>
       </w:tr>
     </w:tbl>
+    <w:p>
+      <w:r>
+        <w:br w:type="page"/>
+      </w:r>
+    </w:p>
+    <w:p>
+      <w:pPr>
+        <w:pStyle w:val="Ttulo1"/>
+      </w:pPr>
+      <w:r>
+        <w:t>Anexo 07. Evidencias tecnicas de implementacion, calidad y cumplimiento</w:t>
+      </w:r>
+    </w:p>
+    <w:p>
+      <w:r>
+        <w:t>Este apartado consolida evidencias visuales para la tesis: resultado de SonarCloud, base de datos fisica, procesos institucionales hospitalarios y orientacion con normas ISO/NIST.</w:t>
+      </w:r>
+    </w:p>
+    <w:p>
+      <w:pPr>
+        <w:pStyle w:val="Ttulo2"/>
+      </w:pPr>
+      <w:r>
+        <w:t>Figura E1. Evidencia SonarCloud y GitHub Actions</w:t>
+      </w:r>
+    </w:p>
+    <w:p>
+      <w:r>
+        <w:t>Quality Gate OK, cero bugs, cero vulnerabilidades, cero code smells, cero hotspots y duplicacion 0.0%.</w:t>
+      </w:r>
+    </w:p>
+    <w:p>
+      <w:pPr>
+        <w:jc w:val="center"/>
+      </w:pPr>
+      <w:r>
+        <w:drawing>
+          <wp:inline xmlns:a="http://schemas.openxmlformats.org/drawingml/2006/main" xmlns:pic="http://schemas.openxmlformats.org/drawingml/2006/picture">
+            <wp:extent cx="5943600" cy="3632200"/>
+            <wp:docPr id="4" name="Picture 4"/>
+            <wp:cNvGraphicFramePr>
+              <a:graphicFrameLocks noChangeAspect="1"/>
+            </wp:cNvGraphicFramePr>
+            <a:graphic>
+              <a:graphicData uri="http://schemas.openxmlformats.org/drawingml/2006/picture">
+                <pic:pic>
+                  <pic:nvPicPr>
+                    <pic:cNvPr id="0" name="sonarqube_quality_gate.png"/>
+                    <pic:cNvPicPr/>
+                  </pic:nvPicPr>
+                  <pic:blipFill>
+                    <a:blip r:embed="rId16"/>
+                    <a:stretch>
+                      <a:fillRect/>
+                    </a:stretch>
+                  </pic:blipFill>
+                  <pic:spPr>
+                    <a:xfrm>
+                      <a:off x="0" y="0"/>
+                      <a:ext cx="5943600" cy="3632200"/>
+                    </a:xfrm>
+                    <a:prstGeom prst="rect"/>
+                  </pic:spPr>
+                </pic:pic>
+              </a:graphicData>
+            </a:graphic>
+          </wp:inline>
+        </w:drawing>
+      </w:r>
+    </w:p>
+    <w:p>
+      <w:pPr>
+        <w:pStyle w:val="Ttulo2"/>
+      </w:pPr>
+      <w:r>
+        <w:t>Figura E2. Resumen de base de datos fisica</w:t>
+      </w:r>
+    </w:p>
+    <w:p>
+      <w:r>
+        <w:t>Modelo formal de 60 tablas y 8 tablas operativas visibles en PostgreSQL.</w:t>
+      </w:r>
+    </w:p>
+    <w:p>
+      <w:pPr>
+        <w:jc w:val="center"/>
+      </w:pPr>
+      <w:r>
+        <w:drawing>
+          <wp:inline xmlns:a="http://schemas.openxmlformats.org/drawingml/2006/main" xmlns:pic="http://schemas.openxmlformats.org/drawingml/2006/picture">
+            <wp:extent cx="5943600" cy="3962400"/>
+            <wp:docPr id="5" name="Picture 5"/>
+            <wp:cNvGraphicFramePr>
+              <a:graphicFrameLocks noChangeAspect="1"/>
+            </wp:cNvGraphicFramePr>
+            <a:graphic>
+              <a:graphicData uri="http://schemas.openxmlformats.org/drawingml/2006/picture">
+                <pic:pic>
+                  <pic:nvPicPr>
+                    <pic:cNvPr id="0" name="base_datos_60_tablas.png"/>
+                    <pic:cNvPicPr/>
+                  </pic:nvPicPr>
+                  <pic:blipFill>
+                    <a:blip r:embed="rId17"/>
+                    <a:stretch>
+                      <a:fillRect/>
+                    </a:stretch>
+                  </pic:blipFill>
+                  <pic:spPr>
+                    <a:xfrm>
+                      <a:off x="0" y="0"/>
+                      <a:ext cx="5943600" cy="3962400"/>
+                    </a:xfrm>
+                    <a:prstGeom prst="rect"/>
+                  </pic:spPr>
+                </pic:pic>
+              </a:graphicData>
+            </a:graphic>
+          </wp:inline>
+        </w:drawing>
+      </w:r>
+    </w:p>
+    <w:p>
+      <w:pPr>
+        <w:pStyle w:val="Ttulo2"/>
+      </w:pPr>
+      <w:r>
+        <w:t>Figura E3. Listado visual de 60 tablas</w:t>
+      </w:r>
+    </w:p>
+    <w:p>
+      <w:r>
+        <w:t>Listado de tablas academicas del esquema PostgreSQL documentado.</w:t>
+      </w:r>
+    </w:p>
+    <w:p>
+      <w:pPr>
+        <w:jc w:val="center"/>
+      </w:pPr>
+      <w:r>
+        <w:drawing>
+          <wp:inline xmlns:a="http://schemas.openxmlformats.org/drawingml/2006/main" xmlns:pic="http://schemas.openxmlformats.org/drawingml/2006/picture">
+            <wp:extent cx="5943600" cy="4622800"/>
+            <wp:docPr id="6" name="Picture 6"/>
+            <wp:cNvGraphicFramePr>
+              <a:graphicFrameLocks noChangeAspect="1"/>
+            </wp:cNvGraphicFramePr>
+            <a:graphic>
+              <a:graphicData uri="http://schemas.openxmlformats.org/drawingml/2006/picture">
+                <pic:pic>
+                  <pic:nvPicPr>
+                    <pic:cNvPr id="0" name="base_datos_listado_60_tablas.png"/>
+                    <pic:cNvPicPr/>
+                  </pic:nvPicPr>
+                  <pic:blipFill>
+                    <a:blip r:embed="rId18"/>
+                    <a:stretch>
+                      <a:fillRect/>
+                    </a:stretch>
+                  </pic:blipFill>
+                  <pic:spPr>
+                    <a:xfrm>
+                      <a:off x="0" y="0"/>
+                      <a:ext cx="5943600" cy="4622800"/>
+                    </a:xfrm>
+                    <a:prstGeom prst="rect"/>
+                  </pic:spPr>
+                </pic:pic>
+              </a:graphicData>
+            </a:graphic>
+          </wp:inline>
+        </w:drawing>
+      </w:r>
+    </w:p>
+    <w:p>
+      <w:pPr>
+        <w:pStyle w:val="Ttulo2"/>
+      </w:pPr>
+      <w:r>
+        <w:t>Figura E4. Proceso institucional hospitalario IDS-ML</w:t>
+      </w:r>
+    </w:p>
+    <w:p>
+      <w:r>
+        <w:t>Flujo tipo Bizagi/BPMN para monitoreo, deteccion, respuesta, reporte y mejora continua.</w:t>
+      </w:r>
+    </w:p>
+    <w:p>
+      <w:pPr>
+        <w:jc w:val="center"/>
+      </w:pPr>
+      <w:r>
+        <w:drawing>
+          <wp:inline xmlns:a="http://schemas.openxmlformats.org/drawingml/2006/main" xmlns:pic="http://schemas.openxmlformats.org/drawingml/2006/picture">
+            <wp:extent cx="5943600" cy="3753853"/>
+            <wp:docPr id="7" name="Picture 7"/>
+            <wp:cNvGraphicFramePr>
+              <a:graphicFrameLocks noChangeAspect="1"/>
+            </wp:cNvGraphicFramePr>
+            <a:graphic>
+              <a:graphicData uri="http://schemas.openxmlformats.org/drawingml/2006/picture">
+                <pic:pic>
+                  <pic:nvPicPr>
+                    <pic:cNvPr id="0" name="proceso_hospital_ids_ml_bpmn.png"/>
+                    <pic:cNvPicPr/>
+                  </pic:nvPicPr>
+                  <pic:blipFill>
+                    <a:blip r:embed="rId19"/>
+                    <a:stretch>
+                      <a:fillRect/>
+                    </a:stretch>
+                  </pic:blipFill>
+                  <pic:spPr>
+                    <a:xfrm>
+                      <a:off x="0" y="0"/>
+                      <a:ext cx="5943600" cy="3753853"/>
+                    </a:xfrm>
+                    <a:prstGeom prst="rect"/>
+                  </pic:spPr>
+                </pic:pic>
+              </a:graphicData>
+            </a:graphic>
+          </wp:inline>
+        </w:drawing>
+      </w:r>
+    </w:p>
+    <w:p>
+      <w:pPr>
+        <w:pStyle w:val="Ttulo2"/>
+      </w:pPr>
+      <w:r>
+        <w:t>Figura E5. Orientacion normativa ISO/NIST</w:t>
+      </w:r>
+    </w:p>
+    <w:p>
+      <w:r>
+        <w:t>Relacion con ISO/IEC 27001, ISO/IEC 25010 y NIST CSF.</w:t>
+      </w:r>
+    </w:p>
+    <w:p>
+      <w:pPr>
+        <w:jc w:val="center"/>
+      </w:pPr>
+      <w:r>
+        <w:drawing>
+          <wp:inline xmlns:a="http://schemas.openxmlformats.org/drawingml/2006/main" xmlns:pic="http://schemas.openxmlformats.org/drawingml/2006/picture">
+            <wp:extent cx="5943600" cy="3632200"/>
+            <wp:docPr id="8" name="Picture 8"/>
+            <wp:cNvGraphicFramePr>
+              <a:graphicFrameLocks noChangeAspect="1"/>
+            </wp:cNvGraphicFramePr>
+            <a:graphic>
+              <a:graphicData uri="http://schemas.openxmlformats.org/drawingml/2006/picture">
+                <pic:pic>
+                  <pic:nvPicPr>
+                    <pic:cNvPr id="0" name="orientacion_iso_nist_ids_ml.png"/>
+                    <pic:cNvPicPr/>
+                  </pic:nvPicPr>
+                  <pic:blipFill>
+                    <a:blip r:embed="rId20"/>
+                    <a:stretch>
+                      <a:fillRect/>
+                    </a:stretch>
+                  </pic:blipFill>
+                  <pic:spPr>
+                    <a:xfrm>
+                      <a:off x="0" y="0"/>
+                      <a:ext cx="5943600" cy="3632200"/>
+                    </a:xfrm>
+                    <a:prstGeom prst="rect"/>
+                  </pic:spPr>
+                </pic:pic>
+              </a:graphicData>
+            </a:graphic>
+          </wp:inline>
+        </w:drawing>
+      </w:r>
+    </w:p>
+    <w:p>
+      <w:pPr>
+        <w:pStyle w:val="Ttulo2"/>
+      </w:pPr>
+      <w:r>
+        <w:t>Uso academico</w:t>
+      </w:r>
+    </w:p>
+    <w:p>
+      <w:r>
+        <w:t>Estas evidencias pueden ubicarse en anexos o en los capitulos de implementacion, validacion, base de datos, calidad de software y alineacion normativa. Si el repositorio cambia, se recomienda regenerar las imagenes para mantener coherencia entre informe, codigo fuente y despliegue.</w:t>
+      </w:r>
+    </w:p>
     <w:sectPr>
       <w:footerReference w:type="default" r:id="rId15"/>
       <w:pgSz w:w="11906" w:h="16838" w:code="9"/>

</xml_diff>

<commit_message>
Agregar evidencias reales de herramientas
</commit_message>
<xml_diff>
--- a/docs/INFORME_FINAL_IDSML_HOSPITAL_CARRION.docx
+++ b/docs/INFORME_FINAL_IDSML_HOSPITAL_CARRION.docx
@@ -38562,6 +38562,278 @@
     <w:p>
       <w:r>
         <w:t>Estas evidencias pueden ubicarse en anexos o en los capitulos de implementacion, validacion, base de datos, calidad de software y alineacion normativa. Si el repositorio cambia, se recomienda regenerar las imagenes para mantener coherencia entre informe, codigo fuente y despliegue.</w:t>
+      </w:r>
+    </w:p>
+    <w:p>
+      <w:r>
+        <w:br w:type="page"/>
+      </w:r>
+    </w:p>
+    <w:p>
+      <w:pPr>
+        <w:pStyle w:val="Ttulo1"/>
+      </w:pPr>
+      <w:r>
+        <w:t>Anexo 08. Evidencias reales de ejecucion y herramientas</w:t>
+      </w:r>
+    </w:p>
+    <w:p>
+      <w:r>
+        <w:t>Este apartado contiene evidencias reales capturadas desde herramientas y servicios vinculados al proyecto: aplicacion Streamlit, Adminer/PostgreSQL, SonarCloud y GitHub Actions. No corresponde a mockups ni laminas generadas.</w:t>
+      </w:r>
+    </w:p>
+    <w:p>
+      <w:pPr>
+        <w:pStyle w:val="Ttulo2"/>
+      </w:pPr>
+      <w:r>
+        <w:t>Figura R1. Aplicacion Streamlit real en ejecucion</w:t>
+      </w:r>
+    </w:p>
+    <w:p>
+      <w:r>
+        <w:t>Captura real de la aplicacion IDS-ML ejecutandose en Docker y mostrando el dashboard con motor PostgreSQL.</w:t>
+      </w:r>
+    </w:p>
+    <w:p>
+      <w:pPr>
+        <w:jc w:val="center"/>
+      </w:pPr>
+      <w:r>
+        <w:drawing>
+          <wp:inline xmlns:a="http://schemas.openxmlformats.org/drawingml/2006/main" xmlns:pic="http://schemas.openxmlformats.org/drawingml/2006/picture">
+            <wp:extent cx="5943600" cy="4160520"/>
+            <wp:docPr id="9" name="Picture 9"/>
+            <wp:cNvGraphicFramePr>
+              <a:graphicFrameLocks noChangeAspect="1"/>
+            </wp:cNvGraphicFramePr>
+            <a:graphic>
+              <a:graphicData uri="http://schemas.openxmlformats.org/drawingml/2006/picture">
+                <pic:pic>
+                  <pic:nvPicPr>
+                    <pic:cNvPr id="0" name="streamlit_dashboard_real.png"/>
+                    <pic:cNvPicPr/>
+                  </pic:nvPicPr>
+                  <pic:blipFill>
+                    <a:blip r:embed="rId21"/>
+                    <a:stretch>
+                      <a:fillRect/>
+                    </a:stretch>
+                  </pic:blipFill>
+                  <pic:spPr>
+                    <a:xfrm>
+                      <a:off x="0" y="0"/>
+                      <a:ext cx="5943600" cy="4160520"/>
+                    </a:xfrm>
+                    <a:prstGeom prst="rect"/>
+                  </pic:spPr>
+                </pic:pic>
+              </a:graphicData>
+            </a:graphic>
+          </wp:inline>
+        </w:drawing>
+      </w:r>
+    </w:p>
+    <w:p>
+      <w:pPr>
+        <w:pStyle w:val="Ttulo2"/>
+      </w:pPr>
+      <w:r>
+        <w:t>Figura R2. Base de datos fisica en Adminer/PostgreSQL</w:t>
+      </w:r>
+    </w:p>
+    <w:p>
+      <w:r>
+        <w:t>Captura real del gestor Adminer conectado a PostgreSQL. Se observan 68 tablas visibles en el esquema public.</w:t>
+      </w:r>
+    </w:p>
+    <w:p>
+      <w:pPr>
+        <w:jc w:val="center"/>
+      </w:pPr>
+      <w:r>
+        <w:drawing>
+          <wp:inline xmlns:a="http://schemas.openxmlformats.org/drawingml/2006/main" xmlns:pic="http://schemas.openxmlformats.org/drawingml/2006/picture">
+            <wp:extent cx="5943600" cy="15667330"/>
+            <wp:docPr id="10" name="Picture 10"/>
+            <wp:cNvGraphicFramePr>
+              <a:graphicFrameLocks noChangeAspect="1"/>
+            </wp:cNvGraphicFramePr>
+            <a:graphic>
+              <a:graphicData uri="http://schemas.openxmlformats.org/drawingml/2006/picture">
+                <pic:pic>
+                  <pic:nvPicPr>
+                    <pic:cNvPr id="0" name="adminer_postgresql_tablas_real.png"/>
+                    <pic:cNvPicPr/>
+                  </pic:nvPicPr>
+                  <pic:blipFill>
+                    <a:blip r:embed="rId22"/>
+                    <a:stretch>
+                      <a:fillRect/>
+                    </a:stretch>
+                  </pic:blipFill>
+                  <pic:spPr>
+                    <a:xfrm>
+                      <a:off x="0" y="0"/>
+                      <a:ext cx="5943600" cy="15667330"/>
+                    </a:xfrm>
+                    <a:prstGeom prst="rect"/>
+                  </pic:spPr>
+                </pic:pic>
+              </a:graphicData>
+            </a:graphic>
+          </wp:inline>
+        </w:drawing>
+      </w:r>
+    </w:p>
+    <w:p>
+      <w:pPr>
+        <w:pStyle w:val="Ttulo2"/>
+      </w:pPr>
+      <w:r>
+        <w:t>Figura R3. Dashboard real de SonarCloud</w:t>
+      </w:r>
+    </w:p>
+    <w:p>
+      <w:r>
+        <w:t>Captura real del dashboard SonarCloud con Quality Gate aprobado, 0 issues y duplicacion 0.0%.</w:t>
+      </w:r>
+    </w:p>
+    <w:p>
+      <w:pPr>
+        <w:jc w:val="center"/>
+      </w:pPr>
+      <w:r>
+        <w:drawing>
+          <wp:inline xmlns:a="http://schemas.openxmlformats.org/drawingml/2006/main" xmlns:pic="http://schemas.openxmlformats.org/drawingml/2006/picture">
+            <wp:extent cx="5943600" cy="4540250"/>
+            <wp:docPr id="11" name="Picture 11"/>
+            <wp:cNvGraphicFramePr>
+              <a:graphicFrameLocks noChangeAspect="1"/>
+            </wp:cNvGraphicFramePr>
+            <a:graphic>
+              <a:graphicData uri="http://schemas.openxmlformats.org/drawingml/2006/picture">
+                <pic:pic>
+                  <pic:nvPicPr>
+                    <pic:cNvPr id="0" name="sonarcloud_dashboard_real.png"/>
+                    <pic:cNvPicPr/>
+                  </pic:nvPicPr>
+                  <pic:blipFill>
+                    <a:blip r:embed="rId23"/>
+                    <a:stretch>
+                      <a:fillRect/>
+                    </a:stretch>
+                  </pic:blipFill>
+                  <pic:spPr>
+                    <a:xfrm>
+                      <a:off x="0" y="0"/>
+                      <a:ext cx="5943600" cy="4540250"/>
+                    </a:xfrm>
+                    <a:prstGeom prst="rect"/>
+                  </pic:spPr>
+                </pic:pic>
+              </a:graphicData>
+            </a:graphic>
+          </wp:inline>
+        </w:drawing>
+      </w:r>
+    </w:p>
+    <w:p>
+      <w:pPr>
+        <w:pStyle w:val="Ttulo2"/>
+      </w:pPr>
+      <w:r>
+        <w:t>Figura R4. GitHub Actions real</w:t>
+      </w:r>
+    </w:p>
+    <w:p>
+      <w:r>
+        <w:t>Captura real del workflow Quality and Sonar finalizado en estado success.</w:t>
+      </w:r>
+    </w:p>
+    <w:p>
+      <w:pPr>
+        <w:jc w:val="center"/>
+      </w:pPr>
+      <w:r>
+        <w:drawing>
+          <wp:inline xmlns:a="http://schemas.openxmlformats.org/drawingml/2006/main" xmlns:pic="http://schemas.openxmlformats.org/drawingml/2006/picture">
+            <wp:extent cx="5943600" cy="4540250"/>
+            <wp:docPr id="12" name="Picture 12"/>
+            <wp:cNvGraphicFramePr>
+              <a:graphicFrameLocks noChangeAspect="1"/>
+            </wp:cNvGraphicFramePr>
+            <a:graphic>
+              <a:graphicData uri="http://schemas.openxmlformats.org/drawingml/2006/picture">
+                <pic:pic>
+                  <pic:nvPicPr>
+                    <pic:cNvPr id="0" name="github_actions_success_real.png"/>
+                    <pic:cNvPicPr/>
+                  </pic:nvPicPr>
+                  <pic:blipFill>
+                    <a:blip r:embed="rId24"/>
+                    <a:stretch>
+                      <a:fillRect/>
+                    </a:stretch>
+                  </pic:blipFill>
+                  <pic:spPr>
+                    <a:xfrm>
+                      <a:off x="0" y="0"/>
+                      <a:ext cx="5943600" cy="4540250"/>
+                    </a:xfrm>
+                    <a:prstGeom prst="rect"/>
+                  </pic:spPr>
+                </pic:pic>
+              </a:graphicData>
+            </a:graphic>
+          </wp:inline>
+        </w:drawing>
+      </w:r>
+    </w:p>
+    <w:p>
+      <w:pPr>
+        <w:pStyle w:val="Ttulo2"/>
+      </w:pPr>
+      <w:r>
+        <w:t>Archivos tecnicos de respaldo</w:t>
+      </w:r>
+    </w:p>
+    <w:p>
+      <w:r>
+        <w:t>docs/evidencias/reales/postgresql_tablas_reales.txt</w:t>
+      </w:r>
+    </w:p>
+    <w:p>
+      <w:r>
+        <w:t>docs/evidencias/reales/postgresql_conteo_tablas_reales.txt</w:t>
+      </w:r>
+    </w:p>
+    <w:p>
+      <w:r>
+        <w:t>docs/evidencias/reales/sonarcloud_quality_gate_api_real.json</w:t>
+      </w:r>
+    </w:p>
+    <w:p>
+      <w:r>
+        <w:t>docs/evidencias/reales/sonarcloud_metrics_api_real.json</w:t>
+      </w:r>
+    </w:p>
+    <w:p>
+      <w:r>
+        <w:t>docs/evidencias/reales/github_actions_latest_run_real.json</w:t>
+      </w:r>
+    </w:p>
+    <w:p>
+      <w:pPr>
+        <w:pStyle w:val="Ttulo2"/>
+      </w:pPr>
+      <w:r>
+        <w:t>Pendiente Bizagi</w:t>
+      </w:r>
+    </w:p>
+    <w:p>
+      <w:r>
+        <w:t>No se encontro un archivo real de Bizagi o BPMN exportado del proceso hospitalario. Si el asesor solicita esa evidencia, se debe anexar un .bpm, .bpmn, PNG, JPG o PDF exportado desde Bizagi Modeler.</w:t>
       </w:r>
     </w:p>
     <w:sectPr>

</xml_diff>